<commit_message>
docs: update lab03 report, rename lab04 report to report4.docx
</commit_message>
<xml_diff>
--- a/lab03-linked-list/docs/lab-report.docx
+++ b/lab03-linked-list/docs/lab-report.docx
@@ -641,7 +641,32 @@
                 <w:szCs w:val="30"/>
                 <w:u w:val="single"/>
               </w:rPr>
-              <w:t xml:space="preserve">          袁群杰           </w:t>
+              <w:t xml:space="preserve">          </w:t>
+            </w:r>
+            <w:r>
+              <w:rPr>
+                <w:rFonts w:hint="eastAsia" w:eastAsia="宋体" w:cs="Times New Roman" w:asciiTheme="minorEastAsia" w:hAnsiTheme="minorEastAsia"/>
+                <w:b/>
+                <w:w w:val="90"/>
+                <w:kern w:val="0"/>
+                <w:sz w:val="30"/>
+                <w:szCs w:val="30"/>
+                <w:u w:val="single"/>
+                <w:lang w:val="en-US" w:eastAsia="zh-CN"/>
+              </w:rPr>
+              <w:t>宋子杨</w:t>
+            </w:r>
+            <w:r>
+              <w:rPr>
+                <w:rFonts w:hint="eastAsia" w:eastAsia="宋体" w:cs="Times New Roman" w:asciiTheme="minorEastAsia" w:hAnsiTheme="minorEastAsia"/>
+                <w:b/>
+                <w:w w:val="90"/>
+                <w:kern w:val="0"/>
+                <w:sz w:val="30"/>
+                <w:szCs w:val="30"/>
+                <w:u w:val="single"/>
+              </w:rPr>
+              <w:t xml:space="preserve">          </w:t>
             </w:r>
           </w:p>
         </w:tc>
@@ -697,7 +722,34 @@
                 <w:szCs w:val="30"/>
                 <w:u w:val="single"/>
               </w:rPr>
-              <w:t xml:space="preserve">   202504170231   </w:t>
+              <w:t xml:space="preserve">   20250417023</w:t>
+            </w:r>
+            <w:r>
+              <w:rPr>
+                <w:rFonts w:hint="eastAsia" w:eastAsia="宋体" w:cs="Times New Roman" w:asciiTheme="minorEastAsia" w:hAnsiTheme="minorEastAsia"/>
+                <w:b/>
+                <w:w w:val="90"/>
+                <w:kern w:val="0"/>
+                <w:sz w:val="30"/>
+                <w:szCs w:val="30"/>
+                <w:u w:val="single"/>
+                <w:lang w:val="en-US" w:eastAsia="zh-CN"/>
+              </w:rPr>
+              <w:t>0</w:t>
+            </w:r>
+            <w:bookmarkStart w:id="0" w:name="_GoBack"/>
+            <w:bookmarkEnd w:id="0"/>
+            <w:r>
+              <w:rPr>
+                <w:rFonts w:hint="eastAsia" w:eastAsia="宋体" w:cs="Times New Roman" w:asciiTheme="minorEastAsia" w:hAnsiTheme="minorEastAsia"/>
+                <w:b/>
+                <w:w w:val="90"/>
+                <w:kern w:val="0"/>
+                <w:sz w:val="30"/>
+                <w:szCs w:val="30"/>
+                <w:u w:val="single"/>
+              </w:rPr>
+              <w:t xml:space="preserve">   </w:t>
             </w:r>
           </w:p>
         </w:tc>
@@ -2917,7 +2969,7 @@
               </w:rPr>
             </w:pPr>
             <w:r>
-              <w:t xml:space="preserve">构建带表头结点的单链表：Node 结点含数据域与 next 指针域，LinkList 类持有表头指针 head，构造时 new 一个仅作占位的表头结点，得到空链表。PushBack 采用尾插法：纯指针从表头走到表尾，把新结点挂到尾部，模拟 VR 物体资源依次入库，全程不借助数组存储、中转数据。Traverse 为只读遍历：先判断 Empty()，空场景单独输出提示；否则从第一个有效结点走到表尾，逐个输出物体 ID 并标注已入库状态，不修改链表结构。遍历需访问全部 n 个结点，时间复杂度 O(n)，额外空间 O(1)；析构逐结点释放，防止内存泄漏。</w:t>
+              <w:t>构建带表头结点的单链表：Node 结点含数据域与 next 指针域，LinkList 类持有表头指针 head，构造时 new 一个仅作占位的表头结点，得到空链表。PushBack 采用尾插法：纯指针从表头走到表尾，把新结点挂到尾部，模拟 VR 物体资源依次入库，全程不借助数组存储、中转数据。Traverse 为只读遍历：先判断 Empty()，空场景单独输出提示；否则从第一个有效结点走到表尾，逐个输出物体 ID 并标注已入库状态，不修改链表结构。遍历需访问全部 n 个结点，时间复杂度 O(n)，额外空间 O(1)；析构逐结点释放，防止内存泄漏。</w:t>
             </w:r>
           </w:p>
           <w:p>
@@ -2965,163 +3017,436 @@
               </w:rPr>
             </w:pPr>
             <w:r>
-              <w:t xml:space="preserve">// 任务1：单链表基础操作实现（基础必做）</w:t>
-              <w:br/>
-              <w:t xml:space="preserve">// 带表头结点的单链表：尾插法批量录入 VR 物体 ID，纯指针只读遍历</w:t>
-              <w:br/>
-              <w:t xml:space="preserve"/>
-              <w:br/>
-              <w:t xml:space="preserve">#include &lt;iostream&gt;</w:t>
-              <w:br/>
-              <w:t xml:space="preserve">using namespace std;</w:t>
-              <w:br/>
-              <w:t xml:space="preserve"/>
-              <w:br/>
-              <w:t xml:space="preserve">// 结点类：数据域 + 指针域</w:t>
-              <w:br/>
-              <w:t xml:space="preserve">template &lt;typename DataType&gt;</w:t>
-              <w:br/>
-              <w:t xml:space="preserve">struct Node {</w:t>
-              <w:br/>
+              <w:t>// 任务1：单链表基础操作实现（基础必做）</w:t>
+            </w:r>
+            <w:r>
+              <w:br w:type="textWrapping"/>
+            </w:r>
+            <w:r>
+              <w:t>// 带表头结点的单链表：尾插法批量录入 VR 物体 ID，纯指针只读遍历</w:t>
+            </w:r>
+            <w:r>
+              <w:br w:type="textWrapping"/>
+            </w:r>
+            <w:r>
+              <w:br w:type="textWrapping"/>
+            </w:r>
+            <w:r>
+              <w:t>#include &lt;iostream&gt;</w:t>
+            </w:r>
+            <w:r>
+              <w:br w:type="textWrapping"/>
+            </w:r>
+            <w:r>
+              <w:t>using namespace std;</w:t>
+            </w:r>
+            <w:r>
+              <w:br w:type="textWrapping"/>
+            </w:r>
+            <w:r>
+              <w:br w:type="textWrapping"/>
+            </w:r>
+            <w:r>
+              <w:t>// 结点类：数据域 + 指针域</w:t>
+            </w:r>
+            <w:r>
+              <w:br w:type="textWrapping"/>
+            </w:r>
+            <w:r>
+              <w:t>template &lt;typename DataType&gt;</w:t>
+            </w:r>
+            <w:r>
+              <w:br w:type="textWrapping"/>
+            </w:r>
+            <w:r>
+              <w:t>struct Node {</w:t>
+            </w:r>
+            <w:r>
+              <w:br w:type="textWrapping"/>
+            </w:r>
+            <w:r>
               <w:t xml:space="preserve">    DataType data;    // 数据域：物体 ID</w:t>
-              <w:br/>
+            </w:r>
+            <w:r>
+              <w:br w:type="textWrapping"/>
+            </w:r>
+            <w:r>
               <w:t xml:space="preserve">    Node* next;       // 指针域：指向后继结点</w:t>
-              <w:br/>
-              <w:t xml:space="preserve"/>
-              <w:br/>
+            </w:r>
+            <w:r>
+              <w:br w:type="textWrapping"/>
+            </w:r>
+            <w:r>
+              <w:br w:type="textWrapping"/>
+            </w:r>
+            <w:r>
               <w:t xml:space="preserve">    Node() : data(DataType()), next(nullptr) {}</w:t>
-              <w:br/>
+            </w:r>
+            <w:r>
+              <w:br w:type="textWrapping"/>
+            </w:r>
+            <w:r>
               <w:t xml:space="preserve">    explicit Node(DataType v) : data(v), next(nullptr) {}</w:t>
-              <w:br/>
-              <w:t xml:space="preserve">};</w:t>
-              <w:br/>
-              <w:t xml:space="preserve"/>
-              <w:br/>
-              <w:t xml:space="preserve">// 单链表类：带表头结点，表头仅作占位标识，不存有效数据</w:t>
-              <w:br/>
-              <w:t xml:space="preserve">template &lt;typename DataType&gt;</w:t>
-              <w:br/>
-              <w:t xml:space="preserve">class LinkList {</w:t>
-              <w:br/>
-              <w:t xml:space="preserve">public:</w:t>
-              <w:br/>
+            </w:r>
+            <w:r>
+              <w:br w:type="textWrapping"/>
+            </w:r>
+            <w:r>
+              <w:t>};</w:t>
+            </w:r>
+            <w:r>
+              <w:br w:type="textWrapping"/>
+            </w:r>
+            <w:r>
+              <w:br w:type="textWrapping"/>
+            </w:r>
+            <w:r>
+              <w:t>// 单链表类：带表头结点，表头仅作占位标识，不存有效数据</w:t>
+            </w:r>
+            <w:r>
+              <w:br w:type="textWrapping"/>
+            </w:r>
+            <w:r>
+              <w:t>template &lt;typename DataType&gt;</w:t>
+            </w:r>
+            <w:r>
+              <w:br w:type="textWrapping"/>
+            </w:r>
+            <w:r>
+              <w:t>class LinkList {</w:t>
+            </w:r>
+            <w:r>
+              <w:br w:type="textWrapping"/>
+            </w:r>
+            <w:r>
+              <w:t>public:</w:t>
+            </w:r>
+            <w:r>
+              <w:br w:type="textWrapping"/>
+            </w:r>
+            <w:r>
               <w:t xml:space="preserve">    LinkList() : length(0) { head = new Node&lt;DataType&gt;(); }   // 初始化：建立空链表</w:t>
-              <w:br/>
-              <w:t xml:space="preserve"/>
-              <w:br/>
+            </w:r>
+            <w:r>
+              <w:br w:type="textWrapping"/>
+            </w:r>
+            <w:r>
+              <w:br w:type="textWrapping"/>
+            </w:r>
+            <w:r>
               <w:t xml:space="preserve">    ~LinkList() {                                             // 逐结点释放，不留野指针</w:t>
-              <w:br/>
+            </w:r>
+            <w:r>
+              <w:br w:type="textWrapping"/>
+            </w:r>
+            <w:r>
               <w:t xml:space="preserve">        Node&lt;DataType&gt;* p = head;</w:t>
-              <w:br/>
+            </w:r>
+            <w:r>
+              <w:br w:type="textWrapping"/>
+            </w:r>
+            <w:r>
               <w:t xml:space="preserve">        while (p != nullptr) {</w:t>
-              <w:br/>
+            </w:r>
+            <w:r>
+              <w:br w:type="textWrapping"/>
+            </w:r>
+            <w:r>
               <w:t xml:space="preserve">            Node&lt;DataType&gt;* q = p-&gt;next;</w:t>
-              <w:br/>
+            </w:r>
+            <w:r>
+              <w:br w:type="textWrapping"/>
+            </w:r>
+            <w:r>
               <w:t xml:space="preserve">            delete p;</w:t>
-              <w:br/>
+            </w:r>
+            <w:r>
+              <w:br w:type="textWrapping"/>
+            </w:r>
+            <w:r>
               <w:t xml:space="preserve">            p = q;</w:t>
-              <w:br/>
+            </w:r>
+            <w:r>
+              <w:br w:type="textWrapping"/>
+            </w:r>
+            <w:r>
               <w:t xml:space="preserve">        }</w:t>
-              <w:br/>
+            </w:r>
+            <w:r>
+              <w:br w:type="textWrapping"/>
+            </w:r>
+            <w:r>
               <w:t xml:space="preserve">    }</w:t>
-              <w:br/>
-              <w:t xml:space="preserve"/>
-              <w:br/>
+            </w:r>
+            <w:r>
+              <w:br w:type="textWrapping"/>
+            </w:r>
+            <w:r>
+              <w:br w:type="textWrapping"/>
+            </w:r>
+            <w:r>
               <w:t xml:space="preserve">    // 尾插法入库：纯指针从表头走到表尾，把新结点挂到尾部</w:t>
-              <w:br/>
+            </w:r>
+            <w:r>
+              <w:br w:type="textWrapping"/>
+            </w:r>
+            <w:r>
               <w:t xml:space="preserve">    void PushBack(DataType x) {</w:t>
-              <w:br/>
+            </w:r>
+            <w:r>
+              <w:br w:type="textWrapping"/>
+            </w:r>
+            <w:r>
               <w:t xml:space="preserve">        Node&lt;DataType&gt;* p = head;</w:t>
-              <w:br/>
+            </w:r>
+            <w:r>
+              <w:br w:type="textWrapping"/>
+            </w:r>
+            <w:r>
               <w:t xml:space="preserve">        while (p-&gt;next != nullptr) p = p-&gt;next;</w:t>
-              <w:br/>
+            </w:r>
+            <w:r>
+              <w:br w:type="textWrapping"/>
+            </w:r>
+            <w:r>
               <w:t xml:space="preserve">        p-&gt;next = new Node&lt;DataType&gt;(x);</w:t>
-              <w:br/>
+            </w:r>
+            <w:r>
+              <w:br w:type="textWrapping"/>
+            </w:r>
+            <w:r>
               <w:t xml:space="preserve">        length++;</w:t>
-              <w:br/>
+            </w:r>
+            <w:r>
+              <w:br w:type="textWrapping"/>
+            </w:r>
+            <w:r>
               <w:t xml:space="preserve">    }</w:t>
-              <w:br/>
-              <w:t xml:space="preserve"/>
-              <w:br/>
+            </w:r>
+            <w:r>
+              <w:br w:type="textWrapping"/>
+            </w:r>
+            <w:r>
+              <w:br w:type="textWrapping"/>
+            </w:r>
+            <w:r>
               <w:t xml:space="preserve">    bool Empty() const { return head-&gt;next == nullptr; }</w:t>
-              <w:br/>
-              <w:t xml:space="preserve"/>
-              <w:br/>
+            </w:r>
+            <w:r>
+              <w:br w:type="textWrapping"/>
+            </w:r>
+            <w:r>
+              <w:br w:type="textWrapping"/>
+            </w:r>
+            <w:r>
               <w:t xml:space="preserve">    // 只读遍历：从第一个有效结点走到表尾，不修改链表结构与数据</w:t>
-              <w:br/>
+            </w:r>
+            <w:r>
+              <w:br w:type="textWrapping"/>
+            </w:r>
+            <w:r>
               <w:t xml:space="preserve">    void Traverse() const {</w:t>
-              <w:br/>
+            </w:r>
+            <w:r>
+              <w:br w:type="textWrapping"/>
+            </w:r>
+            <w:r>
               <w:t xml:space="preserve">        if (Empty()) {</w:t>
-              <w:br/>
+            </w:r>
+            <w:r>
+              <w:br w:type="textWrapping"/>
+            </w:r>
+            <w:r>
               <w:t xml:space="preserve">            cout &lt;&lt; "当前为空场景，暂无任何物体资源！" &lt;&lt; endl;</w:t>
-              <w:br/>
+            </w:r>
+            <w:r>
+              <w:br w:type="textWrapping"/>
+            </w:r>
+            <w:r>
               <w:t xml:space="preserve">            return;</w:t>
-              <w:br/>
+            </w:r>
+            <w:r>
+              <w:br w:type="textWrapping"/>
+            </w:r>
+            <w:r>
               <w:t xml:space="preserve">        }</w:t>
-              <w:br/>
+            </w:r>
+            <w:r>
+              <w:br w:type="textWrapping"/>
+            </w:r>
+            <w:r>
               <w:t xml:space="preserve">        cout &lt;&lt; "场景物体ID清单（共 " &lt;&lt; length &lt;&lt; " 个，数据状态：已入库）：" &lt;&lt; endl;</w:t>
-              <w:br/>
+            </w:r>
+            <w:r>
+              <w:br w:type="textWrapping"/>
+            </w:r>
+            <w:r>
               <w:t xml:space="preserve">        int idx = 0;</w:t>
-              <w:br/>
+            </w:r>
+            <w:r>
+              <w:br w:type="textWrapping"/>
+            </w:r>
+            <w:r>
               <w:t xml:space="preserve">        for (Node&lt;DataType&gt;* p = head-&gt;next; p != nullptr; p = p-&gt;next) {</w:t>
-              <w:br/>
+            </w:r>
+            <w:r>
+              <w:br w:type="textWrapping"/>
+            </w:r>
+            <w:r>
               <w:t xml:space="preserve">            cout &lt;&lt; "  [" &lt;&lt; ++idx &lt;&lt; "] ID: " &lt;&lt; p-&gt;data &lt;&lt; "  &lt;已入库&gt;" &lt;&lt; endl;</w:t>
-              <w:br/>
+            </w:r>
+            <w:r>
+              <w:br w:type="textWrapping"/>
+            </w:r>
+            <w:r>
               <w:t xml:space="preserve">        }</w:t>
-              <w:br/>
+            </w:r>
+            <w:r>
+              <w:br w:type="textWrapping"/>
+            </w:r>
+            <w:r>
               <w:t xml:space="preserve">    }</w:t>
-              <w:br/>
-              <w:t xml:space="preserve"/>
-              <w:br/>
-              <w:t xml:space="preserve">private:</w:t>
-              <w:br/>
+            </w:r>
+            <w:r>
+              <w:br w:type="textWrapping"/>
+            </w:r>
+            <w:r>
+              <w:br w:type="textWrapping"/>
+            </w:r>
+            <w:r>
+              <w:t>private:</w:t>
+            </w:r>
+            <w:r>
+              <w:br w:type="textWrapping"/>
+            </w:r>
+            <w:r>
               <w:t xml:space="preserve">    Node&lt;DataType&gt;* head;   // 表头指针</w:t>
-              <w:br/>
+            </w:r>
+            <w:r>
+              <w:br w:type="textWrapping"/>
+            </w:r>
+            <w:r>
               <w:t xml:space="preserve">    int length;             // 有效元素个数</w:t>
-              <w:br/>
-              <w:t xml:space="preserve">};</w:t>
-              <w:br/>
-              <w:t xml:space="preserve"/>
-              <w:br/>
-              <w:t xml:space="preserve">int main() {</w:t>
-              <w:br/>
+            </w:r>
+            <w:r>
+              <w:br w:type="textWrapping"/>
+            </w:r>
+            <w:r>
+              <w:t>};</w:t>
+            </w:r>
+            <w:r>
+              <w:br w:type="textWrapping"/>
+            </w:r>
+            <w:r>
+              <w:br w:type="textWrapping"/>
+            </w:r>
+            <w:r>
+              <w:t>int main() {</w:t>
+            </w:r>
+            <w:r>
+              <w:br w:type="textWrapping"/>
+            </w:r>
+            <w:r>
               <w:t xml:space="preserve">    // 1. 初始化：建立带表头的空链表，先验证空场景判断</w:t>
-              <w:br/>
+            </w:r>
+            <w:r>
+              <w:br w:type="textWrapping"/>
+            </w:r>
+            <w:r>
               <w:t xml:space="preserve">    LinkList&lt;int&gt; scene;</w:t>
-              <w:br/>
+            </w:r>
+            <w:r>
+              <w:br w:type="textWrapping"/>
+            </w:r>
+            <w:r>
               <w:t xml:space="preserve">    cout &lt;&lt; "== 场景初始化：带表头空链表创建完成 ==" &lt;&lt; endl;</w:t>
-              <w:br/>
+            </w:r>
+            <w:r>
+              <w:br w:type="textWrapping"/>
+            </w:r>
+            <w:r>
               <w:t xml:space="preserve">    scene.Traverse();</w:t>
-              <w:br/>
-              <w:t xml:space="preserve"/>
-              <w:br/>
+            </w:r>
+            <w:r>
+              <w:br w:type="textWrapping"/>
+            </w:r>
+            <w:r>
+              <w:br w:type="textWrapping"/>
+            </w:r>
+            <w:r>
               <w:t xml:space="preserve">    // 2. 尾插法模拟 VR 引擎资源依次入库（不借助数组中转）</w:t>
-              <w:br/>
+            </w:r>
+            <w:r>
+              <w:br w:type="textWrapping"/>
+            </w:r>
+            <w:r>
               <w:t xml:space="preserve">    cout &lt;&lt; "\n== VR物体资源依次入库：1001 1002 1003 1004 1005 ==" &lt;&lt; endl;</w:t>
-              <w:br/>
+            </w:r>
+            <w:r>
+              <w:br w:type="textWrapping"/>
+            </w:r>
+            <w:r>
               <w:t xml:space="preserve">    scene.PushBack(1001);   // 地面</w:t>
-              <w:br/>
+            </w:r>
+            <w:r>
+              <w:br w:type="textWrapping"/>
+            </w:r>
+            <w:r>
               <w:t xml:space="preserve">    scene.PushBack(1002);   // 墙体</w:t>
-              <w:br/>
+            </w:r>
+            <w:r>
+              <w:br w:type="textWrapping"/>
+            </w:r>
+            <w:r>
               <w:t xml:space="preserve">    scene.PushBack(1003);   // 静态摆件A</w:t>
-              <w:br/>
+            </w:r>
+            <w:r>
+              <w:br w:type="textWrapping"/>
+            </w:r>
+            <w:r>
               <w:t xml:space="preserve">    scene.PushBack(1004);   // 静态摆件B</w:t>
-              <w:br/>
+            </w:r>
+            <w:r>
+              <w:br w:type="textWrapping"/>
+            </w:r>
+            <w:r>
               <w:t xml:space="preserve">    scene.PushBack(1005);   // 氛围光源</w:t>
-              <w:br/>
-              <w:t xml:space="preserve"/>
-              <w:br/>
+            </w:r>
+            <w:r>
+              <w:br w:type="textWrapping"/>
+            </w:r>
+            <w:r>
+              <w:br w:type="textWrapping"/>
+            </w:r>
+            <w:r>
               <w:t xml:space="preserve">    // 3. 只读遍历，输出场景资源清单核对</w:t>
-              <w:br/>
+            </w:r>
+            <w:r>
+              <w:br w:type="textWrapping"/>
+            </w:r>
+            <w:r>
               <w:t xml:space="preserve">    cout &lt;&lt; "\n== 场景资源清单核查 ==" &lt;&lt; endl;</w:t>
-              <w:br/>
+            </w:r>
+            <w:r>
+              <w:br w:type="textWrapping"/>
+            </w:r>
+            <w:r>
               <w:t xml:space="preserve">    scene.Traverse();</w:t>
-              <w:br/>
-              <w:t xml:space="preserve"/>
-              <w:br/>
+            </w:r>
+            <w:r>
+              <w:br w:type="textWrapping"/>
+            </w:r>
+            <w:r>
+              <w:br w:type="textWrapping"/>
+            </w:r>
+            <w:r>
               <w:t xml:space="preserve">    return 0;</w:t>
-              <w:br/>
-              <w:t xml:space="preserve">}</w:t>
+            </w:r>
+            <w:r>
+              <w:br w:type="textWrapping"/>
+            </w:r>
+            <w:r>
+              <w:t>}</w:t>
             </w:r>
           </w:p>
           <w:p>
@@ -3165,7 +3490,7 @@
             <w:r>
               <w:drawing>
                 <wp:inline distT="0" distB="0" distL="0" distR="0">
-                  <wp:extent cx="5100000" cy="2625000"/>
+                  <wp:extent cx="5099685" cy="2624455"/>
                   <wp:effectExtent l="0" t="0" r="0" b="0"/>
                   <wp:docPr id="101" name="task01运行截图"/>
                   <wp:cNvGraphicFramePr>
@@ -3175,11 +3500,13 @@
                     <a:graphicData uri="http://schemas.openxmlformats.org/drawingml/2006/picture">
                       <pic:pic xmlns:pic="http://schemas.openxmlformats.org/drawingml/2006/picture">
                         <pic:nvPicPr>
-                          <pic:cNvPr id="101" name="task01.png"/>
-                          <pic:cNvPicPr/>
+                          <pic:cNvPr id="101" name="task01运行截图"/>
+                          <pic:cNvPicPr>
+                            <a:picLocks noChangeAspect="1"/>
+                          </pic:cNvPicPr>
                         </pic:nvPicPr>
                         <pic:blipFill>
-                          <a:blip r:embed="rId10"/>
+                          <a:blip r:embed="rId5"/>
                           <a:stretch>
                             <a:fillRect/>
                           </a:stretch>
@@ -3611,7 +3938,7 @@
               </w:rPr>
             </w:pPr>
             <w:r>
-              <w:t xml:space="preserve">面向对象双层封装：VRResource 资源类以私有成员封装物体 ID、名称、资源类型、场景坐标 (x,y,z) 多字段数据，并提供 Print 成员函数格式化输出全部属性；Node 结点类持有一个 VRResource 数据域与 next 指针域；LinkList 管理类统一实现建表、尾插、遍历。构造时建立带表头空链表（表头仅占位），PushBack 尾插法批量录入多字段资源，纯指针操作；Traverse 只读遍历，从第一个有效结点起输出每项资源的序号、ID、名称、类型、坐标与状态，遍历前先判空并单独提示空场景；析构按「先存后继、再删当前」逐结点 delete，保证无断链、无野指针。尾插单次需扫描到表尾，最坏 O(n)；遍历 O(n)。</w:t>
+              <w:t>面向对象双层封装：VRResource 资源类以私有成员封装物体 ID、名称、资源类型、场景坐标 (x,y,z) 多字段数据，并提供 Print 成员函数格式化输出全部属性；Node 结点类持有一个 VRResource 数据域与 next 指针域；LinkList 管理类统一实现建表、尾插、遍历。构造时建立带表头空链表（表头仅占位），PushBack 尾插法批量录入多字段资源，纯指针操作；Traverse 只读遍历，从第一个有效结点起输出每项资源的序号、ID、名称、类型、坐标与状态，遍历前先判空并单独提示空场景；析构按「先存后继、再删当前」逐结点 delete，保证无断链、无野指针。尾插单次需扫描到表尾，最坏 O(n)；遍历 O(n)。</w:t>
             </w:r>
           </w:p>
           <w:p>
@@ -3659,211 +3986,574 @@
               </w:rPr>
             </w:pPr>
             <w:r>
-              <w:t xml:space="preserve">// 任务2：单链表基础操作实现（拓展：多字段数据元素）</w:t>
-              <w:br/>
-              <w:t xml:space="preserve">// 双层封装：VRResource 资源类 + Node 结点类 + LinkList 管理类</w:t>
-              <w:br/>
-              <w:t xml:space="preserve">// 带表头结点，尾插法批量入库，纯指针只读遍历，格式化输出全量属性</w:t>
-              <w:br/>
-              <w:t xml:space="preserve"/>
-              <w:br/>
-              <w:t xml:space="preserve">#include &lt;iostream&gt;</w:t>
-              <w:br/>
-              <w:t xml:space="preserve">#include &lt;iomanip&gt;</w:t>
-              <w:br/>
-              <w:t xml:space="preserve">#include &lt;string&gt;</w:t>
-              <w:br/>
-              <w:t xml:space="preserve">using namespace std;</w:t>
-              <w:br/>
-              <w:t xml:space="preserve"/>
-              <w:br/>
-              <w:t xml:space="preserve">// —— 数据元素类：封装一个 VR 场景物体的多字段属性 ——</w:t>
-              <w:br/>
-              <w:t xml:space="preserve">class VRResource {</w:t>
-              <w:br/>
-              <w:t xml:space="preserve">public:</w:t>
-              <w:br/>
+              <w:t>// 任务2：单链表基础操作实现（拓展：多字段数据元素）</w:t>
+            </w:r>
+            <w:r>
+              <w:br w:type="textWrapping"/>
+            </w:r>
+            <w:r>
+              <w:t>// 双层封装：VRResource 资源类 + Node 结点类 + LinkList 管理类</w:t>
+            </w:r>
+            <w:r>
+              <w:br w:type="textWrapping"/>
+            </w:r>
+            <w:r>
+              <w:t>// 带表头结点，尾插法批量入库，纯指针只读遍历，格式化输出全量属性</w:t>
+            </w:r>
+            <w:r>
+              <w:br w:type="textWrapping"/>
+            </w:r>
+            <w:r>
+              <w:br w:type="textWrapping"/>
+            </w:r>
+            <w:r>
+              <w:t>#include &lt;iostream&gt;</w:t>
+            </w:r>
+            <w:r>
+              <w:br w:type="textWrapping"/>
+            </w:r>
+            <w:r>
+              <w:t>#include &lt;iomanip&gt;</w:t>
+            </w:r>
+            <w:r>
+              <w:br w:type="textWrapping"/>
+            </w:r>
+            <w:r>
+              <w:t>#include &lt;string&gt;</w:t>
+            </w:r>
+            <w:r>
+              <w:br w:type="textWrapping"/>
+            </w:r>
+            <w:r>
+              <w:t>using namespace std;</w:t>
+            </w:r>
+            <w:r>
+              <w:br w:type="textWrapping"/>
+            </w:r>
+            <w:r>
+              <w:br w:type="textWrapping"/>
+            </w:r>
+            <w:r>
+              <w:t>// —— 数据元素类：封装一个 VR 场景物体的多字段属性 ——</w:t>
+            </w:r>
+            <w:r>
+              <w:br w:type="textWrapping"/>
+            </w:r>
+            <w:r>
+              <w:t>class VRResource {</w:t>
+            </w:r>
+            <w:r>
+              <w:br w:type="textWrapping"/>
+            </w:r>
+            <w:r>
+              <w:t>public:</w:t>
+            </w:r>
+            <w:r>
+              <w:br w:type="textWrapping"/>
+            </w:r>
+            <w:r>
               <w:t xml:space="preserve">    VRResource(int id = 0, string name = "", string type = "",</w:t>
-              <w:br/>
+            </w:r>
+            <w:r>
+              <w:br w:type="textWrapping"/>
+            </w:r>
+            <w:r>
               <w:t xml:space="preserve">               double x = 0.0, double y = 0.0, double z = 0.0)</w:t>
-              <w:br/>
+            </w:r>
+            <w:r>
+              <w:br w:type="textWrapping"/>
+            </w:r>
+            <w:r>
               <w:t xml:space="preserve">        : id_(id), name_(move(name)), type_(move(type)), x_(x), y_(y), z_(z) {}</w:t>
-              <w:br/>
-              <w:t xml:space="preserve"/>
-              <w:br/>
+            </w:r>
+            <w:r>
+              <w:br w:type="textWrapping"/>
+            </w:r>
+            <w:r>
+              <w:br w:type="textWrapping"/>
+            </w:r>
+            <w:r>
               <w:t xml:space="preserve">    // 格式化输出本物体的全部字段（seq 为资源序号）</w:t>
-              <w:br/>
+            </w:r>
+            <w:r>
+              <w:br w:type="textWrapping"/>
+            </w:r>
+            <w:r>
               <w:t xml:space="preserve">    void Print(int seq) const {</w:t>
-              <w:br/>
+            </w:r>
+            <w:r>
+              <w:br w:type="textWrapping"/>
+            </w:r>
+            <w:r>
               <w:t xml:space="preserve">        cout &lt;&lt; "  [" &lt;&lt; seq &lt;&lt; "] ID: " &lt;&lt; id_</w:t>
-              <w:br/>
+            </w:r>
+            <w:r>
+              <w:br w:type="textWrapping"/>
+            </w:r>
+            <w:r>
               <w:t xml:space="preserve">             &lt;&lt; "  名称: " &lt;&lt; left &lt;&lt; setw(16) &lt;&lt; name_</w:t>
-              <w:br/>
+            </w:r>
+            <w:r>
+              <w:br w:type="textWrapping"/>
+            </w:r>
+            <w:r>
               <w:t xml:space="preserve">             &lt;&lt; " 类型: " &lt;&lt; setw(11) &lt;&lt; type_</w:t>
-              <w:br/>
+            </w:r>
+            <w:r>
+              <w:br w:type="textWrapping"/>
+            </w:r>
+            <w:r>
               <w:t xml:space="preserve">             &lt;&lt; " 坐标: (" &lt;&lt; fixed &lt;&lt; setprecision(1) &lt;&lt; x_ &lt;&lt; ", " &lt;&lt; y_ &lt;&lt; ", " &lt;&lt; z_ &lt;&lt; ")"</w:t>
-              <w:br/>
+            </w:r>
+            <w:r>
+              <w:br w:type="textWrapping"/>
+            </w:r>
+            <w:r>
               <w:t xml:space="preserve">             &lt;&lt; "  &lt;已入库&gt;" &lt;&lt; endl;</w:t>
-              <w:br/>
+            </w:r>
+            <w:r>
+              <w:br w:type="textWrapping"/>
+            </w:r>
+            <w:r>
               <w:t xml:space="preserve">    }</w:t>
-              <w:br/>
-              <w:t xml:space="preserve"/>
-              <w:br/>
-              <w:t xml:space="preserve">private:</w:t>
-              <w:br/>
+            </w:r>
+            <w:r>
+              <w:br w:type="textWrapping"/>
+            </w:r>
+            <w:r>
+              <w:br w:type="textWrapping"/>
+            </w:r>
+            <w:r>
+              <w:t>private:</w:t>
+            </w:r>
+            <w:r>
+              <w:br w:type="textWrapping"/>
+            </w:r>
+            <w:r>
               <w:t xml:space="preserve">    int id_;            // 物体 ID</w:t>
-              <w:br/>
+            </w:r>
+            <w:r>
+              <w:br w:type="textWrapping"/>
+            </w:r>
+            <w:r>
               <w:t xml:space="preserve">    string name_;       // 物体名称</w:t>
-              <w:br/>
+            </w:r>
+            <w:r>
+              <w:br w:type="textWrapping"/>
+            </w:r>
+            <w:r>
               <w:t xml:space="preserve">    string type_;       // 资源类型</w:t>
-              <w:br/>
+            </w:r>
+            <w:r>
+              <w:br w:type="textWrapping"/>
+            </w:r>
+            <w:r>
               <w:t xml:space="preserve">    double x_, y_, z_;  // 场景坐标</w:t>
-              <w:br/>
-              <w:t xml:space="preserve">};</w:t>
-              <w:br/>
-              <w:t xml:space="preserve"/>
-              <w:br/>
-              <w:t xml:space="preserve">// —— 结点类：数据域（VRResource）+ 指针域 ——</w:t>
-              <w:br/>
-              <w:t xml:space="preserve">struct Node {</w:t>
-              <w:br/>
+            </w:r>
+            <w:r>
+              <w:br w:type="textWrapping"/>
+            </w:r>
+            <w:r>
+              <w:t>};</w:t>
+            </w:r>
+            <w:r>
+              <w:br w:type="textWrapping"/>
+            </w:r>
+            <w:r>
+              <w:br w:type="textWrapping"/>
+            </w:r>
+            <w:r>
+              <w:t>// —— 结点类：数据域（VRResource）+ 指针域 ——</w:t>
+            </w:r>
+            <w:r>
+              <w:br w:type="textWrapping"/>
+            </w:r>
+            <w:r>
+              <w:t>struct Node {</w:t>
+            </w:r>
+            <w:r>
+              <w:br w:type="textWrapping"/>
+            </w:r>
+            <w:r>
               <w:t xml:space="preserve">    VRResource data;</w:t>
-              <w:br/>
+            </w:r>
+            <w:r>
+              <w:br w:type="textWrapping"/>
+            </w:r>
+            <w:r>
               <w:t xml:space="preserve">    Node* next;</w:t>
-              <w:br/>
+            </w:r>
+            <w:r>
+              <w:br w:type="textWrapping"/>
+            </w:r>
+            <w:r>
               <w:t xml:space="preserve">    explicit Node(const VRResource&amp; r) : data(r), next(nullptr) {}</w:t>
-              <w:br/>
-              <w:t xml:space="preserve">};</w:t>
-              <w:br/>
-              <w:t xml:space="preserve"/>
-              <w:br/>
-              <w:t xml:space="preserve">// —— 单链表管理类：带表头结点（仅占位，不存有效资源） ——</w:t>
-              <w:br/>
-              <w:t xml:space="preserve">class LinkList {</w:t>
-              <w:br/>
-              <w:t xml:space="preserve">public:</w:t>
-              <w:br/>
+            </w:r>
+            <w:r>
+              <w:br w:type="textWrapping"/>
+            </w:r>
+            <w:r>
+              <w:t>};</w:t>
+            </w:r>
+            <w:r>
+              <w:br w:type="textWrapping"/>
+            </w:r>
+            <w:r>
+              <w:br w:type="textWrapping"/>
+            </w:r>
+            <w:r>
+              <w:t>// —— 单链表管理类：带表头结点（仅占位，不存有效资源） ——</w:t>
+            </w:r>
+            <w:r>
+              <w:br w:type="textWrapping"/>
+            </w:r>
+            <w:r>
+              <w:t>class LinkList {</w:t>
+            </w:r>
+            <w:r>
+              <w:br w:type="textWrapping"/>
+            </w:r>
+            <w:r>
+              <w:t>public:</w:t>
+            </w:r>
+            <w:r>
+              <w:br w:type="textWrapping"/>
+            </w:r>
+            <w:r>
               <w:t xml:space="preserve">    LinkList() : length(0) { head = new Node(VRResource()); }   // 初始化空链表</w:t>
-              <w:br/>
-              <w:t xml:space="preserve"/>
-              <w:br/>
+            </w:r>
+            <w:r>
+              <w:br w:type="textWrapping"/>
+            </w:r>
+            <w:r>
+              <w:br w:type="textWrapping"/>
+            </w:r>
+            <w:r>
               <w:t xml:space="preserve">    ~LinkList() {                                               // 逐结点释放，无断链、无野指针</w:t>
-              <w:br/>
+            </w:r>
+            <w:r>
+              <w:br w:type="textWrapping"/>
+            </w:r>
+            <w:r>
               <w:t xml:space="preserve">        Node* p = head;</w:t>
-              <w:br/>
+            </w:r>
+            <w:r>
+              <w:br w:type="textWrapping"/>
+            </w:r>
+            <w:r>
               <w:t xml:space="preserve">        while (p != nullptr) {</w:t>
-              <w:br/>
+            </w:r>
+            <w:r>
+              <w:br w:type="textWrapping"/>
+            </w:r>
+            <w:r>
               <w:t xml:space="preserve">            Node* q = p-&gt;next;</w:t>
-              <w:br/>
+            </w:r>
+            <w:r>
+              <w:br w:type="textWrapping"/>
+            </w:r>
+            <w:r>
               <w:t xml:space="preserve">            delete p;</w:t>
-              <w:br/>
+            </w:r>
+            <w:r>
+              <w:br w:type="textWrapping"/>
+            </w:r>
+            <w:r>
               <w:t xml:space="preserve">            p = q;</w:t>
-              <w:br/>
+            </w:r>
+            <w:r>
+              <w:br w:type="textWrapping"/>
+            </w:r>
+            <w:r>
               <w:t xml:space="preserve">        }</w:t>
-              <w:br/>
+            </w:r>
+            <w:r>
+              <w:br w:type="textWrapping"/>
+            </w:r>
+            <w:r>
               <w:t xml:space="preserve">    }</w:t>
-              <w:br/>
-              <w:t xml:space="preserve"/>
-              <w:br/>
+            </w:r>
+            <w:r>
+              <w:br w:type="textWrapping"/>
+            </w:r>
+            <w:r>
+              <w:br w:type="textWrapping"/>
+            </w:r>
+            <w:r>
               <w:t xml:space="preserve">    // 尾插法入库：纯指针走到表尾再挂载新结点</w:t>
-              <w:br/>
+            </w:r>
+            <w:r>
+              <w:br w:type="textWrapping"/>
+            </w:r>
+            <w:r>
               <w:t xml:space="preserve">    void PushBack(const VRResource&amp; r) {</w:t>
-              <w:br/>
+            </w:r>
+            <w:r>
+              <w:br w:type="textWrapping"/>
+            </w:r>
+            <w:r>
               <w:t xml:space="preserve">        Node* p = head;</w:t>
-              <w:br/>
+            </w:r>
+            <w:r>
+              <w:br w:type="textWrapping"/>
+            </w:r>
+            <w:r>
               <w:t xml:space="preserve">        while (p-&gt;next != nullptr) p = p-&gt;next;</w:t>
-              <w:br/>
+            </w:r>
+            <w:r>
+              <w:br w:type="textWrapping"/>
+            </w:r>
+            <w:r>
               <w:t xml:space="preserve">        p-&gt;next = new Node(r);</w:t>
-              <w:br/>
+            </w:r>
+            <w:r>
+              <w:br w:type="textWrapping"/>
+            </w:r>
+            <w:r>
               <w:t xml:space="preserve">        length++;</w:t>
-              <w:br/>
+            </w:r>
+            <w:r>
+              <w:br w:type="textWrapping"/>
+            </w:r>
+            <w:r>
               <w:t xml:space="preserve">    }</w:t>
-              <w:br/>
-              <w:t xml:space="preserve"/>
-              <w:br/>
+            </w:r>
+            <w:r>
+              <w:br w:type="textWrapping"/>
+            </w:r>
+            <w:r>
+              <w:br w:type="textWrapping"/>
+            </w:r>
+            <w:r>
               <w:t xml:space="preserve">    bool Empty() const { return head-&gt;next == nullptr; }</w:t>
-              <w:br/>
-              <w:t xml:space="preserve"/>
-              <w:br/>
+            </w:r>
+            <w:r>
+              <w:br w:type="textWrapping"/>
+            </w:r>
+            <w:r>
+              <w:br w:type="textWrapping"/>
+            </w:r>
+            <w:r>
               <w:t xml:space="preserve">    // 只读遍历：从第一个有效数据结点走到表尾，不增删改任何结点</w:t>
-              <w:br/>
+            </w:r>
+            <w:r>
+              <w:br w:type="textWrapping"/>
+            </w:r>
+            <w:r>
               <w:t xml:space="preserve">    void Traverse() const {</w:t>
-              <w:br/>
+            </w:r>
+            <w:r>
+              <w:br w:type="textWrapping"/>
+            </w:r>
+            <w:r>
               <w:t xml:space="preserve">        if (Empty()) {</w:t>
-              <w:br/>
+            </w:r>
+            <w:r>
+              <w:br w:type="textWrapping"/>
+            </w:r>
+            <w:r>
               <w:t xml:space="preserve">            cout &lt;&lt; "当前为空场景，未录入任何资源！" &lt;&lt; endl;</w:t>
-              <w:br/>
+            </w:r>
+            <w:r>
+              <w:br w:type="textWrapping"/>
+            </w:r>
+            <w:r>
               <w:t xml:space="preserve">            return;</w:t>
-              <w:br/>
+            </w:r>
+            <w:r>
+              <w:br w:type="textWrapping"/>
+            </w:r>
+            <w:r>
               <w:t xml:space="preserve">        }</w:t>
-              <w:br/>
+            </w:r>
+            <w:r>
+              <w:br w:type="textWrapping"/>
+            </w:r>
+            <w:r>
               <w:t xml:space="preserve">        cout &lt;&lt; "================ VR场景资源清单 ================" &lt;&lt; endl;</w:t>
-              <w:br/>
+            </w:r>
+            <w:r>
+              <w:br w:type="textWrapping"/>
+            </w:r>
+            <w:r>
               <w:t xml:space="preserve">        int idx = 0;</w:t>
-              <w:br/>
+            </w:r>
+            <w:r>
+              <w:br w:type="textWrapping"/>
+            </w:r>
+            <w:r>
               <w:t xml:space="preserve">        for (Node* p = head-&gt;next; p != nullptr; p = p-&gt;next) {</w:t>
-              <w:br/>
+            </w:r>
+            <w:r>
+              <w:br w:type="textWrapping"/>
+            </w:r>
+            <w:r>
               <w:t xml:space="preserve">            p-&gt;data.Print(++idx);</w:t>
-              <w:br/>
+            </w:r>
+            <w:r>
+              <w:br w:type="textWrapping"/>
+            </w:r>
+            <w:r>
               <w:t xml:space="preserve">        }</w:t>
-              <w:br/>
+            </w:r>
+            <w:r>
+              <w:br w:type="textWrapping"/>
+            </w:r>
+            <w:r>
               <w:t xml:space="preserve">        cout &lt;&lt; "------------------------------------------------" &lt;&lt; endl;</w:t>
-              <w:br/>
+            </w:r>
+            <w:r>
+              <w:br w:type="textWrapping"/>
+            </w:r>
+            <w:r>
               <w:t xml:space="preserve">        cout &lt;&lt; "共 " &lt;&lt; length &lt;&lt; " 项资源，状态：全部已入库" &lt;&lt; endl;</w:t>
-              <w:br/>
+            </w:r>
+            <w:r>
+              <w:br w:type="textWrapping"/>
+            </w:r>
+            <w:r>
               <w:t xml:space="preserve">    }</w:t>
-              <w:br/>
-              <w:t xml:space="preserve"/>
-              <w:br/>
-              <w:t xml:space="preserve">private:</w:t>
-              <w:br/>
+            </w:r>
+            <w:r>
+              <w:br w:type="textWrapping"/>
+            </w:r>
+            <w:r>
+              <w:br w:type="textWrapping"/>
+            </w:r>
+            <w:r>
+              <w:t>private:</w:t>
+            </w:r>
+            <w:r>
+              <w:br w:type="textWrapping"/>
+            </w:r>
+            <w:r>
               <w:t xml:space="preserve">    Node* head;   // 表头指针</w:t>
-              <w:br/>
+            </w:r>
+            <w:r>
+              <w:br w:type="textWrapping"/>
+            </w:r>
+            <w:r>
               <w:t xml:space="preserve">    int length;   // 有效资源数</w:t>
-              <w:br/>
-              <w:t xml:space="preserve">};</w:t>
-              <w:br/>
-              <w:t xml:space="preserve"/>
-              <w:br/>
-              <w:t xml:space="preserve">int main() {</w:t>
-              <w:br/>
+            </w:r>
+            <w:r>
+              <w:br w:type="textWrapping"/>
+            </w:r>
+            <w:r>
+              <w:t>};</w:t>
+            </w:r>
+            <w:r>
+              <w:br w:type="textWrapping"/>
+            </w:r>
+            <w:r>
+              <w:br w:type="textWrapping"/>
+            </w:r>
+            <w:r>
+              <w:t>int main() {</w:t>
+            </w:r>
+            <w:r>
+              <w:br w:type="textWrapping"/>
+            </w:r>
+            <w:r>
               <w:t xml:space="preserve">    // 1. 初始化：建立带表头的空链表，验证空场景兼容提示</w:t>
-              <w:br/>
+            </w:r>
+            <w:r>
+              <w:br w:type="textWrapping"/>
+            </w:r>
+            <w:r>
               <w:t xml:space="preserve">    LinkList scene;</w:t>
-              <w:br/>
+            </w:r>
+            <w:r>
+              <w:br w:type="textWrapping"/>
+            </w:r>
+            <w:r>
               <w:t xml:space="preserve">    cout &lt;&lt; "== 场景初始化：带表头空链表创建完成 ==" &lt;&lt; endl;</w:t>
-              <w:br/>
+            </w:r>
+            <w:r>
+              <w:br w:type="textWrapping"/>
+            </w:r>
+            <w:r>
               <w:t xml:space="preserve">    scene.Traverse();</w:t>
-              <w:br/>
-              <w:t xml:space="preserve"/>
-              <w:br/>
+            </w:r>
+            <w:r>
+              <w:br w:type="textWrapping"/>
+            </w:r>
+            <w:r>
+              <w:br w:type="textWrapping"/>
+            </w:r>
+            <w:r>
               <w:t xml:space="preserve">    // 2. 尾插法批量录入多字段物体，模拟资源依次入库</w:t>
-              <w:br/>
+            </w:r>
+            <w:r>
+              <w:br w:type="textWrapping"/>
+            </w:r>
+            <w:r>
               <w:t xml:space="preserve">    cout &lt;&lt; "\n== VR物体资源依次入库（5 项） ==" &lt;&lt; endl;</w:t>
-              <w:br/>
+            </w:r>
+            <w:r>
+              <w:br w:type="textWrapping"/>
+            </w:r>
+            <w:r>
               <w:t xml:space="preserve">    scene.PushBack(VRResource(1001, "Ground",        "StaticMesh", 0.0, 0.0, 0.0));   // 地面</w:t>
-              <w:br/>
+            </w:r>
+            <w:r>
+              <w:br w:type="textWrapping"/>
+            </w:r>
+            <w:r>
               <w:t xml:space="preserve">    scene.PushBack(VRResource(1002, "Wall_North",    "StaticMesh", 0.0, 3.0, -8.0));  // 墙体</w:t>
-              <w:br/>
+            </w:r>
+            <w:r>
+              <w:br w:type="textWrapping"/>
+            </w:r>
+            <w:r>
               <w:t xml:space="preserve">    scene.PushBack(VRResource(1003, "Prop_Statue",   "StaticMesh", 4.5, 0.0, 2.0));   // 静态摆件</w:t>
-              <w:br/>
+            </w:r>
+            <w:r>
+              <w:br w:type="textWrapping"/>
+            </w:r>
+            <w:r>
               <w:t xml:space="preserve">    scene.PushBack(VRResource(1004, "Light_Ambient01", "Light",    0.0, 6.0, 0.0));   // 氛围光源</w:t>
-              <w:br/>
+            </w:r>
+            <w:r>
+              <w:br w:type="textWrapping"/>
+            </w:r>
+            <w:r>
               <w:t xml:space="preserve">    scene.PushBack(VRResource(1005, "Prop_Crate",    "StaticMesh", -3.0, 0.5, 1.5));  // 静态摆件</w:t>
-              <w:br/>
-              <w:t xml:space="preserve"/>
-              <w:br/>
+            </w:r>
+            <w:r>
+              <w:br w:type="textWrapping"/>
+            </w:r>
+            <w:r>
+              <w:br w:type="textWrapping"/>
+            </w:r>
+            <w:r>
               <w:t xml:space="preserve">    // 3. 只读遍历，输出全量属性清单</w:t>
-              <w:br/>
+            </w:r>
+            <w:r>
+              <w:br w:type="textWrapping"/>
+            </w:r>
+            <w:r>
               <w:t xml:space="preserve">    cout &lt;&lt; "\n== 场景资源全量信息核查 ==" &lt;&lt; endl;</w:t>
-              <w:br/>
+            </w:r>
+            <w:r>
+              <w:br w:type="textWrapping"/>
+            </w:r>
+            <w:r>
               <w:t xml:space="preserve">    scene.Traverse();</w:t>
-              <w:br/>
-              <w:t xml:space="preserve"/>
-              <w:br/>
+            </w:r>
+            <w:r>
+              <w:br w:type="textWrapping"/>
+            </w:r>
+            <w:r>
+              <w:br w:type="textWrapping"/>
+            </w:r>
+            <w:r>
               <w:t xml:space="preserve">    return 0;</w:t>
-              <w:br/>
-              <w:t xml:space="preserve">}</w:t>
+            </w:r>
+            <w:r>
+              <w:br w:type="textWrapping"/>
+            </w:r>
+            <w:r>
+              <w:t>}</w:t>
             </w:r>
           </w:p>
           <w:p>
@@ -3919,8 +4609,6 @@
               </w:rPr>
               <w:t>）运行截图</w:t>
             </w:r>
-            <w:bookmarkStart w:id="0" w:name="_GoBack"/>
-            <w:bookmarkEnd w:id="0"/>
           </w:p>
           <w:p>
             <w:pPr>
@@ -3929,7 +4617,7 @@
             <w:r>
               <w:drawing>
                 <wp:inline distT="0" distB="0" distL="0" distR="0">
-                  <wp:extent cx="5100000" cy="2039678"/>
+                  <wp:extent cx="5099685" cy="2039620"/>
                   <wp:effectExtent l="0" t="0" r="0" b="0"/>
                   <wp:docPr id="102" name="task02运行截图"/>
                   <wp:cNvGraphicFramePr>
@@ -3939,11 +4627,13 @@
                     <a:graphicData uri="http://schemas.openxmlformats.org/drawingml/2006/picture">
                       <pic:pic xmlns:pic="http://schemas.openxmlformats.org/drawingml/2006/picture">
                         <pic:nvPicPr>
-                          <pic:cNvPr id="102" name="task02.png"/>
-                          <pic:cNvPicPr/>
+                          <pic:cNvPr id="102" name="task02运行截图"/>
+                          <pic:cNvPicPr>
+                            <a:picLocks noChangeAspect="1"/>
+                          </pic:cNvPicPr>
                         </pic:nvPicPr>
                         <pic:blipFill>
-                          <a:blip r:embed="rId11"/>
+                          <a:blip r:embed="rId6"/>
                           <a:stretch>
                             <a:fillRect/>
                           </a:stretch>
@@ -4046,7 +4736,7 @@
           <w:p>
             <w:pPr>
               <w:spacing w:line="420" w:lineRule="exact"/>
-              <w:ind w:firstLine="281" w:firstLineChars="100"/>
+              <w:ind w:firstLine="210" w:firstLineChars="100"/>
               <w:rPr>
                 <w:rFonts w:ascii="Times New Roman" w:cs="Times New Roman" w:hAnsiTheme="minorEastAsia"/>
                 <w:b/>
@@ -4057,7 +4747,7 @@
               </w:rPr>
             </w:pPr>
             <w:r>
-              <w:t xml:space="preserve">本次实验用单链表管理 VR 场景资源：任务1 以带表头结点的单链表存储物体 ID 并只读遍历，任务2 把数据元素扩展为含 ID、名称、类型、坐标的多字段资源类，均采用尾插法批量入库、纯指针遍历输出，并验证了空链表判断逻辑。与顺序表对比：链表插入删除只改指针、不搬移元素，但访问第 i 个元素必须从头结点开始扫描，遍历与按位查找均为 O(n)，且每个结点额外占用一个指针域，体现了「改快查慢」、适合频繁插删的特性。碰到的问题：一是尾插时误把表头占位结点当有效数据处理，输出多出一行，改为从 head-&gt;next 第一个有效结点遍历后解决；二是初版析构函数直接 delete 当前结点导致无法找到后继，用临时指针先保存 next 再释放，逐结点排查解决。心得：链表指针操作要先画「断链—挂载」示意图确认修改顺序，空表、单结点等边界必须单独测试，理解存储结构对操作代价的影响是本次实验的最大收获。</w:t>
+              <w:t>本次实验用单链表管理 VR 场景资源：任务1 以带表头结点的单链表存储物体 ID 并只读遍历，任务2 把数据元素扩展为含 ID、名称、类型、坐标的多字段资源类，均采用尾插法批量入库、纯指针遍历输出，并验证了空链表判断逻辑。与顺序表对比：链表插入删除只改指针、不搬移元素，但访问第 i 个元素必须从头结点开始扫描，遍历与按位查找均为 O(n)，且每个结点额外占用一个指针域，体现了「改快查慢」、适合频繁插删的特性。碰到的问题：一是尾插时误把表头占位结点当有效数据处理，输出多出一行，改为从 head-&gt;next 第一个有效结点遍历后解决；二是初版析构函数直接 delete 当前结点导致无法找到后继，用临时指针先保存 next 再释放，逐结点排查解决。心得：链表指针操作要先画「断链—挂载」示意图确认修改顺序，空表、单结点等边界必须单独测试，理解存储结构对操作代价的影响是本次实验的最大收获。</w:t>
             </w:r>
           </w:p>
           <w:p>
@@ -4625,7 +5315,7 @@
     <w:lsdException w:qFormat="1" w:unhideWhenUsed="0" w:uiPriority="10" w:semiHidden="0" w:name="Title"/>
     <w:lsdException w:uiPriority="99" w:name="Closing"/>
     <w:lsdException w:uiPriority="99" w:name="Signature"/>
-    <w:lsdException w:uiPriority="1" w:name="Default Paragraph Font"/>
+    <w:lsdException w:qFormat="1" w:uiPriority="1" w:name="Default Paragraph Font"/>
     <w:lsdException w:uiPriority="99" w:name="Body Text"/>
     <w:lsdException w:uiPriority="99" w:name="Body Text Indent"/>
     <w:lsdException w:uiPriority="99" w:name="List Continue"/>
@@ -4897,6 +5587,7 @@
     <w:name w:val="Default Paragraph Font"/>
     <w:semiHidden/>
     <w:unhideWhenUsed/>
+    <w:qFormat/>
     <w:uiPriority w:val="1"/>
   </w:style>
   <w:style w:type="table" w:default="1" w:styleId="9">

</xml_diff>